<commit_message>
Power Query files update, add custom/conditional column
</commit_message>
<xml_diff>
--- a/PowerQuery-and-PowerPivot/PowerQuery_Topics.docx
+++ b/PowerQuery-and-PowerPivot/PowerQuery_Topics.docx
@@ -172,6 +172,70 @@
           <w:rFonts w:ascii="Arial" w:hAnsi="Arial" w:cs="Arial"/>
         </w:rPr>
         <w:t>Close &amp; Load vs Close &amp; Load To</w:t>
+      </w:r>
+    </w:p>
+    <w:p>
+      <w:pPr>
+        <w:pStyle w:val="ListBullet"/>
+        <w:rPr>
+          <w:rFonts w:ascii="Arial" w:hAnsi="Arial" w:cs="Arial"/>
+        </w:rPr>
+      </w:pPr>
+      <w:r>
+        <w:rPr>
+          <w:rFonts w:ascii="Arial" w:hAnsi="Arial" w:cs="Arial"/>
+        </w:rPr>
+        <w:t xml:space="preserve">Launch Power Query: Get Data </w:t>
+      </w:r>
+      <w:r>
+        <w:rPr>
+          <w:rFonts w:ascii="Arial" w:hAnsi="Arial" w:cs="Arial"/>
+        </w:rPr>
+        <w:sym w:font="Wingdings" w:char="F0E0"/>
+      </w:r>
+      <w:r>
+        <w:rPr>
+          <w:rFonts w:ascii="Arial" w:hAnsi="Arial" w:cs="Arial"/>
+        </w:rPr>
+        <w:t xml:space="preserve"> Launch Power Query Editor</w:t>
+      </w:r>
+    </w:p>
+    <w:p>
+      <w:pPr>
+        <w:pStyle w:val="ListBullet"/>
+        <w:rPr>
+          <w:rFonts w:ascii="Arial" w:hAnsi="Arial" w:cs="Arial"/>
+        </w:rPr>
+      </w:pPr>
+      <w:r>
+        <w:rPr>
+          <w:rFonts w:ascii="Arial" w:hAnsi="Arial" w:cs="Arial"/>
+        </w:rPr>
+        <w:t xml:space="preserve">Blank Query: Get Data </w:t>
+      </w:r>
+      <w:r>
+        <w:rPr>
+          <w:rFonts w:ascii="Arial" w:hAnsi="Arial" w:cs="Arial"/>
+        </w:rPr>
+        <w:sym w:font="Wingdings" w:char="F0E0"/>
+      </w:r>
+      <w:r>
+        <w:rPr>
+          <w:rFonts w:ascii="Arial" w:hAnsi="Arial" w:cs="Arial"/>
+        </w:rPr>
+        <w:t xml:space="preserve"> From other sources </w:t>
+      </w:r>
+      <w:r>
+        <w:rPr>
+          <w:rFonts w:ascii="Arial" w:hAnsi="Arial" w:cs="Arial"/>
+        </w:rPr>
+        <w:sym w:font="Wingdings" w:char="F0E0"/>
+      </w:r>
+      <w:r>
+        <w:rPr>
+          <w:rFonts w:ascii="Arial" w:hAnsi="Arial" w:cs="Arial"/>
+        </w:rPr>
+        <w:t xml:space="preserve"> Blank Query</w:t>
       </w:r>
     </w:p>
     <w:p>
@@ -796,7 +860,6 @@
         <w:rPr>
           <w:rFonts w:ascii="Arial" w:hAnsi="Arial" w:cs="Arial"/>
         </w:rPr>
-        <w:lastRenderedPageBreak/>
         <w:t xml:space="preserve">You typically don’t need to load the </w:t>
       </w:r>
       <w:r>
@@ -1062,6 +1125,65 @@
     </w:p>
     <w:p>
       <w:pPr>
+        <w:pStyle w:val="ListBullet"/>
+        <w:numPr>
+          <w:ilvl w:val="0"/>
+          <w:numId w:val="0"/>
+        </w:numPr>
+        <w:rPr>
+          <w:rFonts w:ascii="Arial" w:hAnsi="Arial" w:cs="Arial"/>
+        </w:rPr>
+      </w:pPr>
+    </w:p>
+    <w:p>
+      <w:pPr>
+        <w:pStyle w:val="ListBullet"/>
+        <w:rPr>
+          <w:rFonts w:ascii="Arial" w:hAnsi="Arial" w:cs="Arial"/>
+        </w:rPr>
+      </w:pPr>
+      <w:r>
+        <w:rPr>
+          <w:rFonts w:ascii="Arial" w:hAnsi="Arial" w:cs="Arial"/>
+          <w:i/>
+          <w:iCs/>
+        </w:rPr>
+        <w:t>Add Columns in Power Query</w:t>
+      </w:r>
+      <w:r>
+        <w:rPr>
+          <w:rFonts w:ascii="Arial" w:hAnsi="Arial" w:cs="Arial"/>
+        </w:rPr>
+        <w:t xml:space="preserve">: </w:t>
+      </w:r>
+      <w:r>
+        <w:rPr>
+          <w:rFonts w:ascii="Arial" w:hAnsi="Arial" w:cs="Arial"/>
+        </w:rPr>
+        <w:t xml:space="preserve">Add columns </w:t>
+      </w:r>
+      <w:r>
+        <w:rPr>
+          <w:rFonts w:ascii="Arial" w:hAnsi="Arial" w:cs="Arial"/>
+        </w:rPr>
+        <w:sym w:font="Wingdings" w:char="F0E0"/>
+      </w:r>
+      <w:r>
+        <w:rPr>
+          <w:rFonts w:ascii="Arial" w:hAnsi="Arial" w:cs="Arial"/>
+        </w:rPr>
+        <w:t xml:space="preserve"> Columns from example/ custom column/ </w:t>
+      </w:r>
+      <w:r>
+        <w:rPr>
+          <w:rFonts w:ascii="Arial" w:hAnsi="Arial" w:cs="Arial"/>
+          <w:color w:val="EE0000"/>
+        </w:rPr>
+        <w:t>Conditional Column</w:t>
+      </w:r>
+    </w:p>
+    <w:p>
+      <w:pPr>
         <w:rPr>
           <w:rFonts w:ascii="Arial" w:hAnsi="Arial" w:cs="Arial"/>
           <w:b/>
@@ -1362,6 +1484,7 @@
         <w:rPr>
           <w:rFonts w:ascii="Arial" w:hAnsi="Arial" w:cs="Arial"/>
         </w:rPr>
+        <w:lastRenderedPageBreak/>
         <w:t>For example, if you delete a column in original query after creating a duplicate, it will not delete that column in duplicate query.</w:t>
       </w:r>
     </w:p>
@@ -1392,7 +1515,6 @@
           <w:bCs/>
           <w:u w:val="single"/>
         </w:rPr>
-        <w:lastRenderedPageBreak/>
         <w:t>Reference</w:t>
       </w:r>
       <w:r>
@@ -1723,6 +1845,7 @@
         <w:rPr>
           <w:rFonts w:ascii="Arial" w:hAnsi="Arial" w:cs="Arial"/>
         </w:rPr>
+        <w:lastRenderedPageBreak/>
         <w:t xml:space="preserve">M Language is the </w:t>
       </w:r>
       <w:r>
@@ -1766,7 +1889,6 @@
         <w:rPr>
           <w:rFonts w:ascii="Arial" w:hAnsi="Arial" w:cs="Arial"/>
         </w:rPr>
-        <w:lastRenderedPageBreak/>
         <w:t xml:space="preserve">We can see M language in the Advance Editor and in Formula </w:t>
       </w:r>
       <w:r>

</xml_diff>